<commit_message>
UI enhancements and report preparations
</commit_message>
<xml_diff>
--- a/10 blueprint.docx
+++ b/10 blueprint.docx
@@ -66,10 +66,74 @@
       <w:r>
         <w:br w:type="page"/>
       </w:r>
+      <w:r>
+        <w:lastRenderedPageBreak/>
+        <w:drawing>
+          <wp:anchor distT="0" distB="0" distL="114300" distR="114300" simplePos="0" relativeHeight="251672576" behindDoc="0" locked="0" layoutInCell="1" allowOverlap="1" wp14:anchorId="5A9F5921" wp14:editId="3DA22A36">
+            <wp:simplePos x="0" y="0"/>
+            <wp:positionH relativeFrom="margin">
+              <wp:align>center</wp:align>
+            </wp:positionH>
+            <wp:positionV relativeFrom="paragraph">
+              <wp:posOffset>220070</wp:posOffset>
+            </wp:positionV>
+            <wp:extent cx="8966200" cy="4552950"/>
+            <wp:effectExtent l="0" t="0" r="6350" b="0"/>
+            <wp:wrapNone/>
+            <wp:docPr id="763261151" name="Picture 1"/>
+            <wp:cNvGraphicFramePr>
+              <a:graphicFrameLocks xmlns:a="http://schemas.openxmlformats.org/drawingml/2006/main" noChangeAspect="1"/>
+            </wp:cNvGraphicFramePr>
+            <a:graphic xmlns:a="http://schemas.openxmlformats.org/drawingml/2006/main">
+              <a:graphicData uri="http://schemas.openxmlformats.org/drawingml/2006/picture">
+                <pic:pic xmlns:pic="http://schemas.openxmlformats.org/drawingml/2006/picture">
+                  <pic:nvPicPr>
+                    <pic:cNvPr id="763261151" name=""/>
+                    <pic:cNvPicPr/>
+                  </pic:nvPicPr>
+                  <pic:blipFill>
+                    <a:blip r:embed="rId7">
+                      <a:extLst>
+                        <a:ext uri="{28A0092B-C50C-407E-A947-70E740481C1C}">
+                          <a14:useLocalDpi xmlns:a14="http://schemas.microsoft.com/office/drawing/2010/main" val="0"/>
+                        </a:ext>
+                      </a:extLst>
+                    </a:blip>
+                    <a:stretch>
+                      <a:fillRect/>
+                    </a:stretch>
+                  </pic:blipFill>
+                  <pic:spPr>
+                    <a:xfrm>
+                      <a:off x="0" y="0"/>
+                      <a:ext cx="8966200" cy="4552950"/>
+                    </a:xfrm>
+                    <a:prstGeom prst="rect">
+                      <a:avLst/>
+                    </a:prstGeom>
+                  </pic:spPr>
+                </pic:pic>
+              </a:graphicData>
+            </a:graphic>
+            <wp14:sizeRelH relativeFrom="margin">
+              <wp14:pctWidth>0</wp14:pctWidth>
+            </wp14:sizeRelH>
+            <wp14:sizeRelV relativeFrom="margin">
+              <wp14:pctHeight>0</wp14:pctHeight>
+            </wp14:sizeRelV>
+          </wp:anchor>
+        </w:drawing>
+      </w:r>
+      <w:r>
+        <w:br w:type="page"/>
+      </w:r>
     </w:p>
+    <w:p/>
     <w:p>
       <w:r>
-        <w:lastRenderedPageBreak/>
+        <w:rPr>
+          <w:noProof/>
+        </w:rPr>
         <w:drawing>
           <wp:anchor distT="0" distB="0" distL="114300" distR="114300" simplePos="0" relativeHeight="251670528" behindDoc="0" locked="0" layoutInCell="1" allowOverlap="1" wp14:anchorId="5D6746F4" wp14:editId="3C75FBE1">
             <wp:simplePos x="0" y="0"/>
@@ -94,7 +158,7 @@
                     <pic:cNvPicPr/>
                   </pic:nvPicPr>
                   <pic:blipFill>
-                    <a:blip r:embed="rId7">
+                    <a:blip r:embed="rId8">
                       <a:extLst>
                         <a:ext uri="{28A0092B-C50C-407E-A947-70E740481C1C}">
                           <a14:useLocalDpi xmlns:a14="http://schemas.microsoft.com/office/drawing/2010/main" val="0"/>
@@ -160,7 +224,7 @@
                     <pic:cNvPicPr/>
                   </pic:nvPicPr>
                   <pic:blipFill>
-                    <a:blip r:embed="rId8">
+                    <a:blip r:embed="rId9">
                       <a:extLst>
                         <a:ext uri="{28A0092B-C50C-407E-A947-70E740481C1C}">
                           <a14:useLocalDpi xmlns:a14="http://schemas.microsoft.com/office/drawing/2010/main" val="0"/>
@@ -205,6 +269,7 @@
       <w:r>
         <w:rPr>
           <w:rFonts w:ascii="TH SarabunPSK" w:hAnsi="TH SarabunPSK" w:cs="TH SarabunPSK"/>
+          <w:noProof/>
           <w:sz w:val="36"/>
           <w:szCs w:val="36"/>
         </w:rPr>
@@ -233,7 +298,7 @@
                     <pic:cNvPicPr/>
                   </pic:nvPicPr>
                   <pic:blipFill>
-                    <a:blip r:embed="rId9">
+                    <a:blip r:embed="rId10">
                       <a:extLst>
                         <a:ext uri="{28A0092B-C50C-407E-A947-70E740481C1C}">
                           <a14:useLocalDpi xmlns:a14="http://schemas.microsoft.com/office/drawing/2010/main" val="0"/>
@@ -281,6 +346,7 @@
       <w:r>
         <w:rPr>
           <w:rFonts w:ascii="TH SarabunPSK" w:hAnsi="TH SarabunPSK" w:cs="TH SarabunPSK"/>
+          <w:noProof/>
           <w:sz w:val="36"/>
           <w:szCs w:val="36"/>
           <w:cs/>
@@ -310,7 +376,7 @@
                     <pic:cNvPicPr/>
                   </pic:nvPicPr>
                   <pic:blipFill rotWithShape="1">
-                    <a:blip r:embed="rId10">
+                    <a:blip r:embed="rId11">
                       <a:extLst>
                         <a:ext uri="{28A0092B-C50C-407E-A947-70E740481C1C}">
                           <a14:useLocalDpi xmlns:a14="http://schemas.microsoft.com/office/drawing/2010/main" val="0"/>
@@ -393,7 +459,7 @@
                     </pic:cNvPicPr>
                   </pic:nvPicPr>
                   <pic:blipFill>
-                    <a:blip r:embed="rId11" cstate="print">
+                    <a:blip r:embed="rId12" cstate="print">
                       <a:extLst>
                         <a:ext uri="{28A0092B-C50C-407E-A947-70E740481C1C}">
                           <a14:useLocalDpi xmlns:a14="http://schemas.microsoft.com/office/drawing/2010/main" val="0"/>
@@ -470,7 +536,7 @@
                     </pic:cNvPicPr>
                   </pic:nvPicPr>
                   <pic:blipFill>
-                    <a:blip r:embed="rId12" cstate="print">
+                    <a:blip r:embed="rId13" cstate="print">
                       <a:extLst>
                         <a:ext uri="{28A0092B-C50C-407E-A947-70E740481C1C}">
                           <a14:useLocalDpi xmlns:a14="http://schemas.microsoft.com/office/drawing/2010/main" val="0"/>
@@ -546,7 +612,7 @@
                     </pic:cNvPicPr>
                   </pic:nvPicPr>
                   <pic:blipFill>
-                    <a:blip r:embed="rId13" cstate="print">
+                    <a:blip r:embed="rId14" cstate="print">
                       <a:extLst>
                         <a:ext uri="{28A0092B-C50C-407E-A947-70E740481C1C}">
                           <a14:useLocalDpi xmlns:a14="http://schemas.microsoft.com/office/drawing/2010/main" val="0"/>
@@ -588,12 +654,10 @@
       </w:r>
     </w:p>
     <w:p>
-      <w:pPr>
+      <w:r>
         <w:rPr>
-          <w:rFonts w:hint="cs"/>
+          <w:noProof/>
         </w:rPr>
-      </w:pPr>
-      <w:r>
         <w:lastRenderedPageBreak/>
         <w:drawing>
           <wp:inline distT="0" distB="0" distL="0" distR="0" wp14:anchorId="1A8A8B7E" wp14:editId="0EB76FD5">
@@ -611,7 +675,7 @@
                     <pic:cNvPicPr/>
                   </pic:nvPicPr>
                   <pic:blipFill>
-                    <a:blip r:embed="rId14"/>
+                    <a:blip r:embed="rId15"/>
                     <a:stretch>
                       <a:fillRect/>
                     </a:stretch>
@@ -632,6 +696,9 @@
         </w:drawing>
       </w:r>
       <w:r>
+        <w:rPr>
+          <w:noProof/>
+        </w:rPr>
         <w:drawing>
           <wp:anchor distT="0" distB="0" distL="114300" distR="114300" simplePos="0" relativeHeight="251671552" behindDoc="0" locked="0" layoutInCell="1" allowOverlap="1" wp14:anchorId="4E622738" wp14:editId="7239FF6A">
             <wp:simplePos x="0" y="0"/>
@@ -656,7 +723,7 @@
                     <pic:cNvPicPr/>
                   </pic:nvPicPr>
                   <pic:blipFill rotWithShape="1">
-                    <a:blip r:embed="rId14">
+                    <a:blip r:embed="rId15">
                       <a:extLst>
                         <a:ext uri="{28A0092B-C50C-407E-A947-70E740481C1C}">
                           <a14:useLocalDpi xmlns:a14="http://schemas.microsoft.com/office/drawing/2010/main" val="0"/>

</xml_diff>

<commit_message>
Update drug info modal to show all fields and fix print preview dark theme issue
</commit_message>
<xml_diff>
--- a/10 blueprint.docx
+++ b/10 blueprint.docx
@@ -72,16 +72,16 @@
         </w:rPr>
         <w:lastRenderedPageBreak/>
         <w:drawing>
-          <wp:anchor distT="0" distB="0" distL="114300" distR="114300" simplePos="0" relativeHeight="251672576" behindDoc="0" locked="0" layoutInCell="1" allowOverlap="1" wp14:anchorId="5A9F5921" wp14:editId="2FF7E677">
+          <wp:anchor distT="0" distB="0" distL="114300" distR="114300" simplePos="0" relativeHeight="251672576" behindDoc="0" locked="0" layoutInCell="1" allowOverlap="1" wp14:anchorId="5A9F5921" wp14:editId="0F597766">
             <wp:simplePos x="0" y="0"/>
             <wp:positionH relativeFrom="margin">
               <wp:align>center</wp:align>
             </wp:positionH>
             <wp:positionV relativeFrom="paragraph">
-              <wp:posOffset>695960</wp:posOffset>
+              <wp:posOffset>541921</wp:posOffset>
             </wp:positionV>
-            <wp:extent cx="8966200" cy="4552950"/>
-            <wp:effectExtent l="0" t="0" r="6350" b="0"/>
+            <wp:extent cx="9552487" cy="4850661"/>
+            <wp:effectExtent l="0" t="0" r="0" b="7620"/>
             <wp:wrapNone/>
             <wp:docPr id="763261151" name="Picture 1"/>
             <wp:cNvGraphicFramePr>
@@ -109,7 +109,7 @@
                   <pic:spPr>
                     <a:xfrm>
                       <a:off x="0" y="0"/>
-                      <a:ext cx="8966200" cy="4552950"/>
+                      <a:ext cx="9552487" cy="4850661"/>
                     </a:xfrm>
                     <a:prstGeom prst="rect">
                       <a:avLst/>
@@ -131,23 +131,23 @@
         <w:br w:type="page"/>
       </w:r>
     </w:p>
-    <w:p/>
     <w:p>
       <w:r>
         <w:rPr>
           <w:noProof/>
         </w:rPr>
+        <w:lastRenderedPageBreak/>
         <w:drawing>
-          <wp:anchor distT="0" distB="0" distL="114300" distR="114300" simplePos="0" relativeHeight="251670528" behindDoc="0" locked="0" layoutInCell="1" allowOverlap="1" wp14:anchorId="5D6746F4" wp14:editId="3C75FBE1">
+          <wp:anchor distT="0" distB="0" distL="114300" distR="114300" simplePos="0" relativeHeight="251670528" behindDoc="0" locked="0" layoutInCell="1" allowOverlap="1" wp14:anchorId="5D6746F4" wp14:editId="7D18AEEA">
             <wp:simplePos x="0" y="0"/>
             <wp:positionH relativeFrom="margin">
               <wp:align>center</wp:align>
             </wp:positionH>
             <wp:positionV relativeFrom="paragraph">
-              <wp:posOffset>-244298</wp:posOffset>
+              <wp:posOffset>-308034</wp:posOffset>
             </wp:positionV>
-            <wp:extent cx="9498997" cy="6464595"/>
-            <wp:effectExtent l="0" t="0" r="6985" b="0"/>
+            <wp:extent cx="9639174" cy="6559993"/>
+            <wp:effectExtent l="0" t="0" r="635" b="0"/>
             <wp:wrapNone/>
             <wp:docPr id="1291168661" name="Picture 1"/>
             <wp:cNvGraphicFramePr>
@@ -175,7 +175,7 @@
                   <pic:spPr>
                     <a:xfrm>
                       <a:off x="0" y="0"/>
-                      <a:ext cx="9498997" cy="6464595"/>
+                      <a:ext cx="9639174" cy="6559993"/>
                     </a:xfrm>
                     <a:prstGeom prst="rect">
                       <a:avLst/>
@@ -193,6 +193,8 @@
           </wp:anchor>
         </w:drawing>
       </w:r>
+    </w:p>
+    <w:p>
       <w:r>
         <w:br w:type="page"/>
       </w:r>
@@ -204,13 +206,13 @@
         </w:rPr>
         <w:lastRenderedPageBreak/>
         <w:drawing>
-          <wp:anchor distT="0" distB="0" distL="114300" distR="114300" simplePos="0" relativeHeight="251659264" behindDoc="0" locked="0" layoutInCell="1" allowOverlap="1" wp14:anchorId="57C55BA6" wp14:editId="5A28092D">
+          <wp:anchor distT="0" distB="0" distL="114300" distR="114300" simplePos="0" relativeHeight="251659264" behindDoc="0" locked="0" layoutInCell="1" allowOverlap="1" wp14:anchorId="57C55BA6" wp14:editId="262652C7">
             <wp:simplePos x="0" y="0"/>
             <wp:positionH relativeFrom="margin">
               <wp:align>center</wp:align>
             </wp:positionH>
             <wp:positionV relativeFrom="paragraph">
-              <wp:posOffset>455295</wp:posOffset>
+              <wp:posOffset>232011</wp:posOffset>
             </wp:positionV>
             <wp:extent cx="9729337" cy="5472752"/>
             <wp:effectExtent l="0" t="0" r="5715" b="0"/>
@@ -278,16 +280,16 @@
         </w:rPr>
         <w:lastRenderedPageBreak/>
         <w:drawing>
-          <wp:anchor distT="0" distB="0" distL="114300" distR="114300" simplePos="0" relativeHeight="251661312" behindDoc="0" locked="0" layoutInCell="1" allowOverlap="1" wp14:anchorId="00D2D397" wp14:editId="42837D1E">
+          <wp:anchor distT="0" distB="0" distL="114300" distR="114300" simplePos="0" relativeHeight="251661312" behindDoc="0" locked="0" layoutInCell="1" allowOverlap="1" wp14:anchorId="00D2D397" wp14:editId="29313370">
             <wp:simplePos x="0" y="0"/>
             <wp:positionH relativeFrom="margin">
               <wp:align>center</wp:align>
             </wp:positionH>
             <wp:positionV relativeFrom="paragraph">
-              <wp:posOffset>-286444</wp:posOffset>
+              <wp:posOffset>-127531</wp:posOffset>
             </wp:positionV>
-            <wp:extent cx="9732613" cy="6507125"/>
-            <wp:effectExtent l="0" t="0" r="2540" b="8255"/>
+            <wp:extent cx="9519358" cy="6506722"/>
+            <wp:effectExtent l="0" t="0" r="5715" b="8890"/>
             <wp:wrapNone/>
             <wp:docPr id="1040830582" name="Picture 1"/>
             <wp:cNvGraphicFramePr>
@@ -300,7 +302,7 @@
                     <pic:cNvPr id="1040830582" name=""/>
                     <pic:cNvPicPr/>
                   </pic:nvPicPr>
-                  <pic:blipFill>
+                  <pic:blipFill rotWithShape="1">
                     <a:blip r:embed="rId10">
                       <a:extLst>
                         <a:ext uri="{28A0092B-C50C-407E-A947-70E740481C1C}">
@@ -308,18 +310,27 @@
                         </a:ext>
                       </a:extLst>
                     </a:blip>
+                    <a:srcRect l="2185"/>
                     <a:stretch>
                       <a:fillRect/>
                     </a:stretch>
                   </pic:blipFill>
-                  <pic:spPr>
+                  <pic:spPr bwMode="auto">
                     <a:xfrm>
                       <a:off x="0" y="0"/>
-                      <a:ext cx="9732613" cy="6507125"/>
+                      <a:ext cx="9519358" cy="6506722"/>
                     </a:xfrm>
                     <a:prstGeom prst="rect">
                       <a:avLst/>
                     </a:prstGeom>
+                    <a:ln>
+                      <a:noFill/>
+                    </a:ln>
+                    <a:extLst>
+                      <a:ext uri="{53640926-AAD7-44D8-BBD7-CCE9431645EC}">
+                        <a14:shadowObscured xmlns:a14="http://schemas.microsoft.com/office/drawing/2010/main"/>
+                      </a:ext>
+                    </a:extLst>
                   </pic:spPr>
                 </pic:pic>
               </a:graphicData>
@@ -356,16 +367,16 @@
         </w:rPr>
         <w:lastRenderedPageBreak/>
         <w:drawing>
-          <wp:anchor distT="0" distB="0" distL="114300" distR="114300" simplePos="0" relativeHeight="251663360" behindDoc="0" locked="0" layoutInCell="1" allowOverlap="1" wp14:anchorId="1FA98EFD" wp14:editId="504BF8D1">
+          <wp:anchor distT="0" distB="0" distL="114300" distR="114300" simplePos="0" relativeHeight="251663360" behindDoc="0" locked="0" layoutInCell="1" allowOverlap="1" wp14:anchorId="1FA98EFD" wp14:editId="100DC3F3">
             <wp:simplePos x="0" y="0"/>
             <wp:positionH relativeFrom="margin">
               <wp:align>center</wp:align>
             </wp:positionH>
             <wp:positionV relativeFrom="paragraph">
-              <wp:posOffset>-1271639</wp:posOffset>
+              <wp:posOffset>-1536612</wp:posOffset>
             </wp:positionV>
-            <wp:extent cx="6561371" cy="8492901"/>
-            <wp:effectExtent l="5715" t="0" r="0" b="0"/>
+            <wp:extent cx="6966986" cy="9017921"/>
+            <wp:effectExtent l="3175" t="0" r="8890" b="8890"/>
             <wp:wrapNone/>
             <wp:docPr id="1721099433" name="Picture 1"/>
             <wp:cNvGraphicFramePr>
@@ -394,7 +405,7 @@
                   <pic:spPr bwMode="auto">
                     <a:xfrm rot="16200000">
                       <a:off x="0" y="0"/>
-                      <a:ext cx="6561371" cy="8492901"/>
+                      <a:ext cx="6966986" cy="9017921"/>
                     </a:xfrm>
                     <a:prstGeom prst="rect">
                       <a:avLst/>
@@ -514,15 +525,15 @@
         </w:rPr>
         <w:lastRenderedPageBreak/>
         <w:drawing>
-          <wp:anchor distT="0" distB="0" distL="114300" distR="114300" simplePos="0" relativeHeight="251673600" behindDoc="0" locked="0" layoutInCell="1" allowOverlap="1" wp14:anchorId="3B472EBA" wp14:editId="2E65D53E">
+          <wp:anchor distT="0" distB="0" distL="114300" distR="114300" simplePos="0" relativeHeight="251673600" behindDoc="0" locked="0" layoutInCell="1" allowOverlap="1" wp14:anchorId="3B472EBA" wp14:editId="543D4808">
             <wp:simplePos x="0" y="0"/>
             <wp:positionH relativeFrom="margin">
-              <wp:posOffset>-414345</wp:posOffset>
+              <wp:align>center</wp:align>
             </wp:positionH>
             <wp:positionV relativeFrom="paragraph">
-              <wp:posOffset>106325</wp:posOffset>
+              <wp:posOffset>287537</wp:posOffset>
             </wp:positionV>
-            <wp:extent cx="9281041" cy="5220586"/>
+            <wp:extent cx="9564061" cy="5379785"/>
             <wp:effectExtent l="0" t="0" r="0" b="0"/>
             <wp:wrapNone/>
             <wp:docPr id="446267079" name="Picture 1"/>
@@ -551,7 +562,7 @@
                   <pic:spPr>
                     <a:xfrm>
                       <a:off x="0" y="0"/>
-                      <a:ext cx="9281041" cy="5220586"/>
+                      <a:ext cx="9564061" cy="5379785"/>
                     </a:xfrm>
                     <a:prstGeom prst="rect">
                       <a:avLst/>

</xml_diff>